<commit_message>
4 and 2 lab for kiba
</commit_message>
<xml_diff>
--- a/2 семак/Лабы/Кибернетика/2 ЛАБ/Яричевский БПИ2503 Лаб2 Кибернетика.docx
+++ b/2 семак/Лабы/Кибернетика/2 ЛАБ/Яричевский БПИ2503 Лаб2 Кибернетика.docx
@@ -515,70 +515,13 @@
           <w:sz w:val="28"/>
           <w:szCs w:val="28"/>
         </w:rPr>
-        <w:t xml:space="preserve">: </w:t>
-      </w:r>
-      <w:r>
-        <w:rPr>
-          <w:rFonts w:ascii="Times New Roman" w:hAnsi="Times New Roman" w:cs="Times New Roman"/>
-          <w:sz w:val="28"/>
-          <w:szCs w:val="28"/>
-        </w:rPr>
-        <w:t>чтение и запись данных, безусловный переход по адресу.</w:t>
-      </w:r>
-    </w:p>
-    <w:p>
-      <w:pPr>
-        <w:pStyle w:val="a7"/>
-        <w:numPr>
-          <w:ilvl w:val="0"/>
-          <w:numId w:val="1"/>
-        </w:numPr>
+        <w:t>: чтение и запись данных, безусловный переход по адресу.</w:t>
+      </w:r>
+    </w:p>
+    <w:p>
+      <w:pPr>
         <w:spacing w:line="360" w:lineRule="auto"/>
-        <w:rPr>
-          <w:rFonts w:ascii="Times New Roman" w:hAnsi="Times New Roman" w:cs="Times New Roman"/>
-          <w:sz w:val="28"/>
-          <w:szCs w:val="28"/>
-        </w:rPr>
-      </w:pPr>
-      <w:r>
-        <w:rPr>
-          <w:rFonts w:ascii="Times New Roman" w:hAnsi="Times New Roman" w:cs="Times New Roman"/>
-          <w:sz w:val="28"/>
-          <w:szCs w:val="28"/>
-        </w:rPr>
-        <w:t>На</w:t>
-      </w:r>
-      <w:r>
-        <w:rPr>
-          <w:rFonts w:ascii="Times New Roman" w:hAnsi="Times New Roman" w:cs="Times New Roman"/>
-          <w:sz w:val="28"/>
-          <w:szCs w:val="28"/>
-        </w:rPr>
-        <w:t>писать</w:t>
-      </w:r>
-      <w:r>
-        <w:rPr>
-          <w:rFonts w:ascii="Times New Roman" w:hAnsi="Times New Roman" w:cs="Times New Roman"/>
-          <w:sz w:val="28"/>
-          <w:szCs w:val="28"/>
-        </w:rPr>
-        <w:t xml:space="preserve"> программу, которая умножает число в регистре R0 на 1010, но при этом не применяет оператор </w:t>
-      </w:r>
-      <w:proofErr w:type="spellStart"/>
-      <w:r>
-        <w:rPr>
-          <w:rFonts w:ascii="Times New Roman" w:hAnsi="Times New Roman" w:cs="Times New Roman"/>
-          <w:sz w:val="28"/>
-          <w:szCs w:val="28"/>
-        </w:rPr>
-        <w:t>mul</w:t>
-      </w:r>
-      <w:proofErr w:type="spellEnd"/>
-    </w:p>
-    <w:p>
-      <w:pPr>
-        <w:pStyle w:val="a7"/>
-        <w:spacing w:line="360" w:lineRule="auto"/>
+        <w:ind w:firstLine="708"/>
         <w:rPr>
           <w:rFonts w:ascii="Times New Roman" w:hAnsi="Times New Roman" w:cs="Times New Roman"/>
           <w:sz w:val="28"/>
@@ -663,6 +606,7 @@
       <w:r>
         <w:rPr>
           <w:rFonts w:ascii="Times New Roman" w:hAnsi="Times New Roman" w:cs="Times New Roman"/>
+          <w:noProof/>
           <w:sz w:val="28"/>
           <w:szCs w:val="28"/>
         </w:rPr>
@@ -748,6 +692,7 @@
       <w:r>
         <w:rPr>
           <w:rFonts w:ascii="Times New Roman" w:hAnsi="Times New Roman" w:cs="Times New Roman"/>
+          <w:noProof/>
           <w:sz w:val="28"/>
           <w:szCs w:val="28"/>
         </w:rPr>
@@ -808,7 +753,6 @@
           <w:sz w:val="28"/>
           <w:szCs w:val="28"/>
         </w:rPr>
-        <w:lastRenderedPageBreak/>
         <w:t>Функции перехода</w:t>
       </w:r>
       <w:r>
@@ -835,17 +779,16 @@
       <w:r>
         <w:rPr>
           <w:rFonts w:ascii="Times New Roman" w:hAnsi="Times New Roman" w:cs="Times New Roman"/>
-          <w:b/>
-          <w:bCs/>
-          <w:noProof/>
-          <w:sz w:val="28"/>
-          <w:szCs w:val="28"/>
-        </w:rPr>
+          <w:sz w:val="28"/>
+          <w:szCs w:val="28"/>
+          <w:lang w:val="en-US"/>
+        </w:rPr>
+        <w:lastRenderedPageBreak/>
         <w:drawing>
-          <wp:inline distT="0" distB="0" distL="0" distR="0" wp14:anchorId="64274145" wp14:editId="0428F7F2">
-            <wp:extent cx="2851150" cy="1765549"/>
-            <wp:effectExtent l="0" t="0" r="6350" b="6350"/>
-            <wp:docPr id="11" name="Рисунок 11" descr="Изображение выглядит как линия, диаграмма&#10;&#10;Содержимое, созданное искусственным интеллектом, может быть неверным."/>
+          <wp:inline distT="0" distB="0" distL="0" distR="0" wp14:anchorId="6A7BC8CA" wp14:editId="74539320">
+            <wp:extent cx="3627967" cy="2134509"/>
+            <wp:effectExtent l="0" t="0" r="0" b="0"/>
+            <wp:docPr id="1666106723" name="Рисунок 1"/>
             <wp:cNvGraphicFramePr>
               <a:graphicFrameLocks xmlns:a="http://schemas.openxmlformats.org/drawingml/2006/main" noChangeAspect="1"/>
             </wp:cNvGraphicFramePr>
@@ -853,7 +796,7 @@
               <a:graphicData uri="http://schemas.openxmlformats.org/drawingml/2006/picture">
                 <pic:pic xmlns:pic="http://schemas.openxmlformats.org/drawingml/2006/picture">
                   <pic:nvPicPr>
-                    <pic:cNvPr id="11" name="Рисунок 11" descr="Изображение выглядит как линия, диаграмма&#10;&#10;Содержимое, созданное искусственным интеллектом, может быть неверным."/>
+                    <pic:cNvPr id="1666106723" name=""/>
                     <pic:cNvPicPr/>
                   </pic:nvPicPr>
                   <pic:blipFill>
@@ -865,7 +808,7 @@
                   <pic:spPr>
                     <a:xfrm>
                       <a:off x="0" y="0"/>
-                      <a:ext cx="2865492" cy="1774430"/>
+                      <a:ext cx="3635669" cy="2139041"/>
                     </a:xfrm>
                     <a:prstGeom prst="rect">
                       <a:avLst/>
@@ -1094,6 +1037,7 @@
       <w:r>
         <w:rPr>
           <w:rFonts w:ascii="Times New Roman" w:hAnsi="Times New Roman" w:cs="Times New Roman"/>
+          <w:noProof/>
           <w:sz w:val="28"/>
           <w:szCs w:val="28"/>
         </w:rPr>
@@ -1226,6 +1170,7 @@
       </w:pPr>
       <w:r>
         <w:rPr>
+          <w:noProof/>
           <w:sz w:val="20"/>
           <w:szCs w:val="20"/>
           <w:lang w:val="en-US"/>
@@ -2332,7 +2277,6 @@
                 <w:noProof/>
                 <w:sz w:val="28"/>
                 <w:szCs w:val="28"/>
-                <w:lang w:val="en-US"/>
               </w:rPr>
             </w:pPr>
             <w:r>
@@ -2343,9 +2287,8 @@
                 <w:noProof/>
                 <w:sz w:val="28"/>
                 <w:szCs w:val="28"/>
-                <w:lang w:val="en-US"/>
-              </w:rPr>
-              <w:t>LT</w:t>
+              </w:rPr>
+              <w:t>SHL</w:t>
             </w:r>
           </w:p>
         </w:tc>
@@ -2377,6 +2320,144 @@
                 <w:lang w:val="en-US"/>
               </w:rPr>
               <w:t>0110</w:t>
+            </w:r>
+          </w:p>
+        </w:tc>
+        <w:tc>
+          <w:tcPr>
+            <w:tcW w:w="2336" w:type="dxa"/>
+          </w:tcPr>
+          <w:p>
+            <w:pPr>
+              <w:jc w:val="center"/>
+              <w:rPr>
+                <w:rFonts w:ascii="Times New Roman" w:hAnsi="Times New Roman" w:cs="Times New Roman"/>
+                <w:b/>
+                <w:bCs/>
+                <w:noProof/>
+                <w:sz w:val="28"/>
+                <w:szCs w:val="28"/>
+                <w:lang w:val="en-US"/>
+              </w:rPr>
+            </w:pPr>
+            <w:r>
+              <w:rPr>
+                <w:rFonts w:ascii="Times New Roman" w:hAnsi="Times New Roman" w:cs="Times New Roman"/>
+                <w:b/>
+                <w:bCs/>
+                <w:noProof/>
+                <w:sz w:val="28"/>
+                <w:szCs w:val="28"/>
+                <w:lang w:val="en-US"/>
+              </w:rPr>
+              <w:t>xx</w:t>
+            </w:r>
+          </w:p>
+        </w:tc>
+        <w:tc>
+          <w:tcPr>
+            <w:tcW w:w="2337" w:type="dxa"/>
+          </w:tcPr>
+          <w:p>
+            <w:pPr>
+              <w:jc w:val="center"/>
+              <w:rPr>
+                <w:rFonts w:ascii="Times New Roman" w:hAnsi="Times New Roman" w:cs="Times New Roman"/>
+                <w:b/>
+                <w:bCs/>
+                <w:noProof/>
+                <w:sz w:val="28"/>
+                <w:szCs w:val="28"/>
+                <w:lang w:val="en-US"/>
+              </w:rPr>
+            </w:pPr>
+            <w:r>
+              <w:rPr>
+                <w:rFonts w:ascii="Times New Roman" w:hAnsi="Times New Roman" w:cs="Times New Roman"/>
+                <w:b/>
+                <w:bCs/>
+                <w:noProof/>
+                <w:sz w:val="28"/>
+                <w:szCs w:val="28"/>
+                <w:lang w:val="en-US"/>
+              </w:rPr>
+              <w:t>0</w:t>
+            </w:r>
+            <w:r>
+              <w:rPr>
+                <w:rFonts w:ascii="Times New Roman" w:hAnsi="Times New Roman" w:cs="Times New Roman"/>
+                <w:b/>
+                <w:bCs/>
+                <w:noProof/>
+                <w:sz w:val="28"/>
+                <w:szCs w:val="28"/>
+                <w:lang w:val="en-US"/>
+              </w:rPr>
+              <w:t>1</w:t>
+            </w:r>
+          </w:p>
+        </w:tc>
+      </w:tr>
+      <w:tr>
+        <w:tc>
+          <w:tcPr>
+            <w:tcW w:w="2336" w:type="dxa"/>
+          </w:tcPr>
+          <w:p>
+            <w:pPr>
+              <w:jc w:val="center"/>
+              <w:rPr>
+                <w:rFonts w:ascii="Times New Roman" w:hAnsi="Times New Roman" w:cs="Times New Roman"/>
+                <w:b/>
+                <w:bCs/>
+                <w:noProof/>
+                <w:sz w:val="28"/>
+                <w:szCs w:val="28"/>
+                <w:lang w:val="en-US"/>
+              </w:rPr>
+            </w:pPr>
+            <w:r>
+              <w:rPr>
+                <w:rFonts w:ascii="Times New Roman" w:hAnsi="Times New Roman" w:cs="Times New Roman"/>
+                <w:b/>
+                <w:bCs/>
+                <w:noProof/>
+                <w:sz w:val="28"/>
+                <w:szCs w:val="28"/>
+                <w:lang w:val="en-US"/>
+              </w:rPr>
+              <w:t>SAR</w:t>
+            </w:r>
+          </w:p>
+        </w:tc>
+        <w:tc>
+          <w:tcPr>
+            <w:tcW w:w="2336" w:type="dxa"/>
+          </w:tcPr>
+          <w:p>
+            <w:pPr>
+              <w:jc w:val="center"/>
+              <w:rPr>
+                <w:rFonts w:ascii="Times New Roman" w:hAnsi="Times New Roman" w:cs="Times New Roman"/>
+                <w:b/>
+                <w:bCs/>
+                <w:noProof/>
+                <w:sz w:val="28"/>
+                <w:szCs w:val="28"/>
+                <w:lang w:val="en-US"/>
+              </w:rPr>
+            </w:pPr>
+            <w:r>
+              <w:rPr>
+                <w:rFonts w:ascii="Times New Roman" w:hAnsi="Times New Roman" w:cs="Times New Roman"/>
+                <w:b/>
+                <w:bCs/>
+                <w:noProof/>
+                <w:sz w:val="28"/>
+                <w:szCs w:val="28"/>
+                <w:lang w:val="en-US"/>
+              </w:rPr>
+              <w:t>0111</w:t>
             </w:r>
           </w:p>
         </w:tc>
@@ -2471,6 +2552,132 @@
                 <w:szCs w:val="28"/>
                 <w:lang w:val="en-US"/>
               </w:rPr>
+              <w:t>SHR</w:t>
+            </w:r>
+          </w:p>
+        </w:tc>
+        <w:tc>
+          <w:tcPr>
+            <w:tcW w:w="2336" w:type="dxa"/>
+          </w:tcPr>
+          <w:p>
+            <w:pPr>
+              <w:jc w:val="center"/>
+              <w:rPr>
+                <w:rFonts w:ascii="Times New Roman" w:hAnsi="Times New Roman" w:cs="Times New Roman"/>
+                <w:b/>
+                <w:bCs/>
+                <w:noProof/>
+                <w:sz w:val="28"/>
+                <w:szCs w:val="28"/>
+                <w:lang w:val="en-US"/>
+              </w:rPr>
+            </w:pPr>
+            <w:r>
+              <w:rPr>
+                <w:rFonts w:ascii="Times New Roman" w:hAnsi="Times New Roman" w:cs="Times New Roman"/>
+                <w:b/>
+                <w:bCs/>
+                <w:noProof/>
+                <w:sz w:val="28"/>
+                <w:szCs w:val="28"/>
+                <w:lang w:val="en-US"/>
+              </w:rPr>
+              <w:t>1000</w:t>
+            </w:r>
+          </w:p>
+        </w:tc>
+        <w:tc>
+          <w:tcPr>
+            <w:tcW w:w="2336" w:type="dxa"/>
+          </w:tcPr>
+          <w:p>
+            <w:pPr>
+              <w:jc w:val="center"/>
+              <w:rPr>
+                <w:rFonts w:ascii="Times New Roman" w:hAnsi="Times New Roman" w:cs="Times New Roman"/>
+                <w:b/>
+                <w:bCs/>
+                <w:noProof/>
+                <w:sz w:val="28"/>
+                <w:szCs w:val="28"/>
+                <w:lang w:val="en-US"/>
+              </w:rPr>
+            </w:pPr>
+            <w:r>
+              <w:rPr>
+                <w:rFonts w:ascii="Times New Roman" w:hAnsi="Times New Roman" w:cs="Times New Roman"/>
+                <w:b/>
+                <w:bCs/>
+                <w:noProof/>
+                <w:sz w:val="28"/>
+                <w:szCs w:val="28"/>
+                <w:lang w:val="en-US"/>
+              </w:rPr>
+              <w:t>xx</w:t>
+            </w:r>
+          </w:p>
+        </w:tc>
+        <w:tc>
+          <w:tcPr>
+            <w:tcW w:w="2337" w:type="dxa"/>
+          </w:tcPr>
+          <w:p>
+            <w:pPr>
+              <w:jc w:val="center"/>
+              <w:rPr>
+                <w:rFonts w:ascii="Times New Roman" w:hAnsi="Times New Roman" w:cs="Times New Roman"/>
+                <w:b/>
+                <w:bCs/>
+                <w:noProof/>
+                <w:sz w:val="28"/>
+                <w:szCs w:val="28"/>
+                <w:lang w:val="en-US"/>
+              </w:rPr>
+            </w:pPr>
+            <w:r>
+              <w:rPr>
+                <w:rFonts w:ascii="Times New Roman" w:hAnsi="Times New Roman" w:cs="Times New Roman"/>
+                <w:b/>
+                <w:bCs/>
+                <w:noProof/>
+                <w:sz w:val="28"/>
+                <w:szCs w:val="28"/>
+                <w:lang w:val="en-US"/>
+              </w:rPr>
+              <w:t>01</w:t>
+            </w:r>
+          </w:p>
+        </w:tc>
+      </w:tr>
+      <w:tr>
+        <w:tc>
+          <w:tcPr>
+            <w:tcW w:w="2336" w:type="dxa"/>
+          </w:tcPr>
+          <w:p>
+            <w:pPr>
+              <w:jc w:val="center"/>
+              <w:rPr>
+                <w:rFonts w:ascii="Times New Roman" w:hAnsi="Times New Roman" w:cs="Times New Roman"/>
+                <w:b/>
+                <w:bCs/>
+                <w:noProof/>
+                <w:sz w:val="28"/>
+                <w:szCs w:val="28"/>
+                <w:lang w:val="en-US"/>
+              </w:rPr>
+            </w:pPr>
+            <w:r>
+              <w:rPr>
+                <w:rFonts w:ascii="Times New Roman" w:hAnsi="Times New Roman" w:cs="Times New Roman"/>
+                <w:b/>
+                <w:bCs/>
+                <w:noProof/>
+                <w:sz w:val="28"/>
+                <w:szCs w:val="28"/>
+                <w:lang w:val="en-US"/>
+              </w:rPr>
               <w:t>SAV(x)</w:t>
             </w:r>
           </w:p>
@@ -3286,6 +3493,7 @@
           <w:szCs w:val="28"/>
           <w:lang w:val="en-US"/>
         </w:rPr>
+        <w:lastRenderedPageBreak/>
         <w:t>OR</w:t>
       </w:r>
       <w:r>
@@ -3358,28 +3566,30 @@
           <w:noProof/>
           <w:sz w:val="28"/>
           <w:szCs w:val="28"/>
-        </w:rPr>
-      </w:pPr>
-      <w:r>
-        <w:rPr>
-          <w:rFonts w:ascii="Times New Roman" w:hAnsi="Times New Roman" w:cs="Times New Roman"/>
-          <w:b/>
-          <w:bCs/>
-          <w:noProof/>
-          <w:sz w:val="28"/>
-          <w:szCs w:val="28"/>
-          <w:lang w:val="en-US"/>
-        </w:rPr>
-        <w:t>LT</w:t>
-      </w:r>
-      <w:r>
-        <w:rPr>
-          <w:rFonts w:ascii="Times New Roman" w:hAnsi="Times New Roman" w:cs="Times New Roman"/>
-          <w:b/>
-          <w:bCs/>
-          <w:noProof/>
-          <w:sz w:val="28"/>
-          <w:szCs w:val="28"/>
+          <w:lang w:val="en-US"/>
+        </w:rPr>
+      </w:pPr>
+      <w:r>
+        <w:rPr>
+          <w:rFonts w:ascii="Times New Roman" w:hAnsi="Times New Roman" w:cs="Times New Roman"/>
+          <w:b/>
+          <w:bCs/>
+          <w:noProof/>
+          <w:sz w:val="28"/>
+          <w:szCs w:val="28"/>
+          <w:lang w:val="en-US"/>
+        </w:rPr>
+        <w:t>SHL</w:t>
+      </w:r>
+      <w:r>
+        <w:rPr>
+          <w:rFonts w:ascii="Times New Roman" w:hAnsi="Times New Roman" w:cs="Times New Roman"/>
+          <w:b/>
+          <w:bCs/>
+          <w:noProof/>
+          <w:sz w:val="28"/>
+          <w:szCs w:val="28"/>
+          <w:lang w:val="en-US"/>
         </w:rPr>
         <w:t xml:space="preserve"> – </w:t>
       </w:r>
@@ -3393,6 +3603,18 @@
           <w:szCs w:val="28"/>
           <w:lang w:val="en-US"/>
         </w:rPr>
+        <w:t xml:space="preserve">shift </w:t>
+      </w:r>
+      <w:r>
+        <w:rPr>
+          <w:rFonts w:ascii="Times New Roman" w:hAnsi="Times New Roman" w:cs="Times New Roman"/>
+          <w:b/>
+          <w:bCs/>
+          <w:noProof/>
+          <w:sz w:val="28"/>
+          <w:szCs w:val="28"/>
+          <w:lang w:val="en-US"/>
+        </w:rPr>
         <w:t>left</w:t>
       </w:r>
       <w:r>
@@ -3403,6 +3625,7 @@
           <w:noProof/>
           <w:sz w:val="28"/>
           <w:szCs w:val="28"/>
+          <w:lang w:val="en-US"/>
         </w:rPr>
         <w:t xml:space="preserve"> –</w:t>
       </w:r>
@@ -3412,6 +3635,7 @@
           <w:noProof/>
           <w:sz w:val="28"/>
           <w:szCs w:val="28"/>
+          <w:lang w:val="en-US"/>
         </w:rPr>
         <w:t xml:space="preserve"> </w:t>
       </w:r>
@@ -3422,7 +3646,222 @@
           <w:sz w:val="28"/>
           <w:szCs w:val="28"/>
         </w:rPr>
-        <w:t>сдвиг влево</w:t>
+        <w:t>сдвиг</w:t>
+      </w:r>
+      <w:r>
+        <w:rPr>
+          <w:rFonts w:ascii="Times New Roman" w:hAnsi="Times New Roman" w:cs="Times New Roman"/>
+          <w:noProof/>
+          <w:sz w:val="28"/>
+          <w:szCs w:val="28"/>
+          <w:lang w:val="en-US"/>
+        </w:rPr>
+        <w:t xml:space="preserve"> </w:t>
+      </w:r>
+      <w:r>
+        <w:rPr>
+          <w:rFonts w:ascii="Times New Roman" w:hAnsi="Times New Roman" w:cs="Times New Roman"/>
+          <w:noProof/>
+          <w:sz w:val="28"/>
+          <w:szCs w:val="28"/>
+        </w:rPr>
+        <w:t>влево</w:t>
+      </w:r>
+    </w:p>
+    <w:p>
+      <w:pPr>
+        <w:rPr>
+          <w:rFonts w:ascii="Times New Roman" w:hAnsi="Times New Roman" w:cs="Times New Roman"/>
+          <w:noProof/>
+          <w:sz w:val="28"/>
+          <w:szCs w:val="28"/>
+          <w:lang w:val="en-US"/>
+        </w:rPr>
+      </w:pPr>
+      <w:r>
+        <w:rPr>
+          <w:rFonts w:ascii="Times New Roman" w:hAnsi="Times New Roman" w:cs="Times New Roman"/>
+          <w:b/>
+          <w:bCs/>
+          <w:noProof/>
+          <w:sz w:val="28"/>
+          <w:szCs w:val="28"/>
+          <w:lang w:val="en-US"/>
+        </w:rPr>
+        <w:t xml:space="preserve">SAR </w:t>
+      </w:r>
+      <w:r>
+        <w:rPr>
+          <w:rFonts w:ascii="Times New Roman" w:hAnsi="Times New Roman" w:cs="Times New Roman"/>
+          <w:b/>
+          <w:bCs/>
+          <w:noProof/>
+          <w:sz w:val="28"/>
+          <w:szCs w:val="28"/>
+          <w:lang w:val="en-US"/>
+        </w:rPr>
+        <w:t>–</w:t>
+      </w:r>
+      <w:r>
+        <w:rPr>
+          <w:rFonts w:ascii="Times New Roman" w:hAnsi="Times New Roman" w:cs="Times New Roman"/>
+          <w:b/>
+          <w:bCs/>
+          <w:noProof/>
+          <w:sz w:val="28"/>
+          <w:szCs w:val="28"/>
+          <w:lang w:val="en-US"/>
+        </w:rPr>
+        <w:t xml:space="preserve"> </w:t>
+      </w:r>
+      <w:r>
+        <w:rPr>
+          <w:rFonts w:ascii="Times New Roman" w:hAnsi="Times New Roman" w:cs="Times New Roman"/>
+          <w:b/>
+          <w:bCs/>
+          <w:noProof/>
+          <w:sz w:val="28"/>
+          <w:szCs w:val="28"/>
+          <w:lang w:val="en-US"/>
+        </w:rPr>
+        <w:t>shift arithmetic right –</w:t>
+      </w:r>
+      <w:r>
+        <w:rPr>
+          <w:rFonts w:ascii="Times New Roman" w:hAnsi="Times New Roman" w:cs="Times New Roman"/>
+          <w:noProof/>
+          <w:sz w:val="28"/>
+          <w:szCs w:val="28"/>
+          <w:lang w:val="en-US"/>
+        </w:rPr>
+        <w:t xml:space="preserve"> </w:t>
+      </w:r>
+      <w:r>
+        <w:rPr>
+          <w:rFonts w:ascii="Times New Roman" w:hAnsi="Times New Roman" w:cs="Times New Roman"/>
+          <w:noProof/>
+          <w:sz w:val="28"/>
+          <w:szCs w:val="28"/>
+        </w:rPr>
+        <w:t>сдвив</w:t>
+      </w:r>
+      <w:r>
+        <w:rPr>
+          <w:rFonts w:ascii="Times New Roman" w:hAnsi="Times New Roman" w:cs="Times New Roman"/>
+          <w:noProof/>
+          <w:sz w:val="28"/>
+          <w:szCs w:val="28"/>
+          <w:lang w:val="en-US"/>
+        </w:rPr>
+        <w:t xml:space="preserve"> </w:t>
+      </w:r>
+      <w:r>
+        <w:rPr>
+          <w:rFonts w:ascii="Times New Roman" w:hAnsi="Times New Roman" w:cs="Times New Roman"/>
+          <w:noProof/>
+          <w:sz w:val="28"/>
+          <w:szCs w:val="28"/>
+        </w:rPr>
+        <w:t>арифметический</w:t>
+      </w:r>
+      <w:r>
+        <w:rPr>
+          <w:rFonts w:ascii="Times New Roman" w:hAnsi="Times New Roman" w:cs="Times New Roman"/>
+          <w:noProof/>
+          <w:sz w:val="28"/>
+          <w:szCs w:val="28"/>
+          <w:lang w:val="en-US"/>
+        </w:rPr>
+        <w:t xml:space="preserve"> </w:t>
+      </w:r>
+      <w:r>
+        <w:rPr>
+          <w:rFonts w:ascii="Times New Roman" w:hAnsi="Times New Roman" w:cs="Times New Roman"/>
+          <w:noProof/>
+          <w:sz w:val="28"/>
+          <w:szCs w:val="28"/>
+        </w:rPr>
+        <w:t>вправо</w:t>
+      </w:r>
+    </w:p>
+    <w:p>
+      <w:pPr>
+        <w:rPr>
+          <w:rFonts w:ascii="Times New Roman" w:hAnsi="Times New Roman" w:cs="Times New Roman"/>
+          <w:noProof/>
+          <w:sz w:val="28"/>
+          <w:szCs w:val="28"/>
+          <w:lang w:val="en-US"/>
+        </w:rPr>
+      </w:pPr>
+      <w:r>
+        <w:rPr>
+          <w:rFonts w:ascii="Times New Roman" w:hAnsi="Times New Roman" w:cs="Times New Roman"/>
+          <w:b/>
+          <w:bCs/>
+          <w:noProof/>
+          <w:sz w:val="28"/>
+          <w:szCs w:val="28"/>
+          <w:lang w:val="en-US"/>
+        </w:rPr>
+        <w:t>SHR – shift right –</w:t>
+      </w:r>
+      <w:r>
+        <w:rPr>
+          <w:rFonts w:ascii="Times New Roman" w:hAnsi="Times New Roman" w:cs="Times New Roman"/>
+          <w:noProof/>
+          <w:sz w:val="28"/>
+          <w:szCs w:val="28"/>
+          <w:lang w:val="en-US"/>
+        </w:rPr>
+        <w:t xml:space="preserve"> </w:t>
+      </w:r>
+      <w:r>
+        <w:rPr>
+          <w:rFonts w:ascii="Times New Roman" w:hAnsi="Times New Roman" w:cs="Times New Roman"/>
+          <w:noProof/>
+          <w:sz w:val="28"/>
+          <w:szCs w:val="28"/>
+        </w:rPr>
+        <w:t>сдвиг</w:t>
+      </w:r>
+      <w:r>
+        <w:rPr>
+          <w:rFonts w:ascii="Times New Roman" w:hAnsi="Times New Roman" w:cs="Times New Roman"/>
+          <w:noProof/>
+          <w:sz w:val="28"/>
+          <w:szCs w:val="28"/>
+          <w:lang w:val="en-US"/>
+        </w:rPr>
+        <w:t xml:space="preserve"> </w:t>
+      </w:r>
+      <w:r>
+        <w:rPr>
+          <w:rFonts w:ascii="Times New Roman" w:hAnsi="Times New Roman" w:cs="Times New Roman"/>
+          <w:noProof/>
+          <w:sz w:val="28"/>
+          <w:szCs w:val="28"/>
+        </w:rPr>
+        <w:t>в</w:t>
+      </w:r>
+      <w:r>
+        <w:rPr>
+          <w:rFonts w:ascii="Times New Roman" w:hAnsi="Times New Roman" w:cs="Times New Roman"/>
+          <w:noProof/>
+          <w:sz w:val="28"/>
+          <w:szCs w:val="28"/>
+          <w:lang w:val="en-US"/>
+        </w:rPr>
+        <w:t xml:space="preserve"> </w:t>
+      </w:r>
+      <w:r>
+        <w:rPr>
+          <w:rFonts w:ascii="Times New Roman" w:hAnsi="Times New Roman" w:cs="Times New Roman"/>
+          <w:noProof/>
+          <w:sz w:val="28"/>
+          <w:szCs w:val="28"/>
+        </w:rPr>
+        <w:t>право</w:t>
       </w:r>
     </w:p>
     <w:p>
@@ -3433,6 +3872,7 @@
           <w:rFonts w:ascii="Times New Roman" w:hAnsi="Times New Roman" w:cs="Times New Roman"/>
           <w:sz w:val="20"/>
           <w:szCs w:val="20"/>
+          <w:lang w:val="en-US"/>
         </w:rPr>
       </w:pPr>
     </w:p>
@@ -4499,6 +4939,7 @@
   <w:style w:type="character" w:default="1" w:styleId="a0">
     <w:name w:val="Default Paragraph Font"/>
     <w:uiPriority w:val="1"/>
+    <w:semiHidden/>
     <w:unhideWhenUsed/>
   </w:style>
   <w:style w:type="table" w:default="1" w:styleId="a1">

</xml_diff>